<commit_message>
Fix controller and dashboard issues
Fixed clear sessions button not working due to logic flaw in PLAN_STOPPED in the main.py file.
Fixed dashboard not loading data in realtime due to bad filter, removed filter.
</commit_message>
<xml_diff>
--- a/docs/NetLab-Installation-Guide.docx
+++ b/docs/NetLab-Installation-Guide.docx
@@ -124,6 +124,7 @@
         </w:pBdr>
       </w:pPr>
       <w:r>
+        <w:lastRenderedPageBreak/>
         <w:t>Table of Contents</w:t>
       </w:r>
     </w:p>
@@ -164,6 +165,7 @@
         </w:pBdr>
       </w:pPr>
       <w:r>
+        <w:lastRenderedPageBreak/>
         <w:t>1.  Overview</w:t>
       </w:r>
     </w:p>
@@ -331,6 +333,7 @@
         </w:pBdr>
       </w:pPr>
       <w:r>
+        <w:lastRenderedPageBreak/>
         <w:t>2.  Prerequisites</w:t>
       </w:r>
     </w:p>
@@ -1496,6 +1499,7 @@
         </w:pBdr>
       </w:pPr>
       <w:r>
+        <w:lastRenderedPageBreak/>
         <w:t>3.  Network Planning</w:t>
       </w:r>
     </w:p>
@@ -2883,6 +2887,7 @@
         </w:pBdr>
       </w:pPr>
       <w:r>
+        <w:lastRenderedPageBreak/>
         <w:t>4.  Controller VM Setup</w:t>
       </w:r>
     </w:p>
@@ -3261,6 +3266,7 @@
         <w:spacing w:after="100"/>
       </w:pPr>
       <w:r>
+        <w:lastRenderedPageBreak/>
         <w:t>Copy each of the following files from the TrafficGenTool/ folder into the corresponding location in the project tree. These files replace the originals from the base project and include all features developed through Task 5:</w:t>
       </w:r>
     </w:p>
@@ -4834,6 +4840,7 @@
         </w:pBdr>
       </w:pPr>
       <w:r>
+        <w:lastRenderedPageBreak/>
         <w:t>5.  Worker VM Setup</w:t>
       </w:r>
     </w:p>
@@ -5189,6 +5196,15 @@
           <w:szCs w:val="18"/>
         </w:rPr>
         <w:br/>
+      </w:r>
+      <w:r>
+        <w:rPr>
+          <w:rFonts w:ascii="Courier New" w:eastAsia="Courier New" w:hAnsi="Courier New" w:cs="Courier New"/>
+          <w:color w:val="D4D4D4"/>
+          <w:sz w:val="18"/>
+          <w:szCs w:val="18"/>
+        </w:rPr>
+        <w:lastRenderedPageBreak/>
         <w:t xml:space="preserve">  --ip-end     192.168.1.120 \</w:t>
       </w:r>
       <w:r>
@@ -5335,6 +5351,7 @@
         </w:pBdr>
       </w:pPr>
       <w:r>
+        <w:lastRenderedPageBreak/>
         <w:t>6.  NTP Synchronisation</w:t>
       </w:r>
     </w:p>
@@ -5641,6 +5658,7 @@
         </w:pBdr>
       </w:pPr>
       <w:r>
+        <w:lastRenderedPageBreak/>
         <w:t>7.  Running as systemd Services</w:t>
       </w:r>
     </w:p>
@@ -6110,6 +6128,15 @@
           <w:szCs w:val="18"/>
         </w:rPr>
         <w:br/>
+      </w:r>
+      <w:r>
+        <w:rPr>
+          <w:rFonts w:ascii="Courier New" w:eastAsia="Courier New" w:hAnsi="Courier New" w:cs="Courier New"/>
+          <w:color w:val="D4D4D4"/>
+          <w:sz w:val="18"/>
+          <w:szCs w:val="18"/>
+        </w:rPr>
+        <w:lastRenderedPageBreak/>
         <w:t>[Install]</w:t>
       </w:r>
       <w:r>
@@ -6209,6 +6236,7 @@
         </w:pBdr>
       </w:pPr>
       <w:r>
+        <w:lastRenderedPageBreak/>
         <w:t>8.  Running Your First Test</w:t>
       </w:r>
     </w:p>
@@ -6480,6 +6508,7 @@
         </w:pBdr>
       </w:pPr>
       <w:r>
+        <w:lastRenderedPageBreak/>
         <w:t>9.  Configuration Reference</w:t>
       </w:r>
     </w:p>
@@ -8586,6 +8615,7 @@
         </w:pBdr>
       </w:pPr>
       <w:r>
+        <w:lastRenderedPageBreak/>
         <w:t>10.  Troubleshooting</w:t>
       </w:r>
     </w:p>
@@ -9718,6 +9748,7 @@
         <w:pStyle w:val="Heading2"/>
       </w:pPr>
       <w:r>
+        <w:lastRenderedPageBreak/>
         <w:t>10.1  Useful Diagnostic Commands</w:t>
       </w:r>
     </w:p>
@@ -9910,6 +9941,7 @@
         </w:pBdr>
       </w:pPr>
       <w:r>
+        <w:lastRenderedPageBreak/>
         <w:t>11.  Running the Automated Test Suite</w:t>
       </w:r>
     </w:p>
@@ -10887,6 +10919,7 @@
                 <w:sz w:val="20"/>
                 <w:szCs w:val="20"/>
               </w:rPr>
+              <w:lastRenderedPageBreak/>
               <w:t>PLAN_STOPPED</w:t>
             </w:r>
           </w:p>

</xml_diff>